<commit_message>
Add instructor profile to proposal and flyer
Co-Authored-By: Claude Opus 5.5 <noreply@anthropic.com>
Claude-Session: https://claude.ai/code/session_01ASU6ETCN5Sbt1bh9wzP5YS
</commit_message>
<xml_diff>
--- a/勉強会チラシ_施設向け.docx
+++ b/勉強会チラシ_施設向け.docx
@@ -38,7 +38,7 @@
     <w:p>
       <w:pPr>
         <w:shd w:fill="1F4E79" w:color="auto" w:val="clear"/>
-        <w:spacing w:after="120" w:before="0"/>
+        <w:spacing w:after="100" w:before="0"/>
         <w:jc w:val="center"/>
       </w:pPr>
       <w:r>
@@ -55,7 +55,7 @@
     </w:p>
     <w:p>
       <w:pPr>
-        <w:spacing w:after="40"/>
+        <w:spacing w:after="20"/>
         <w:jc w:val="center"/>
       </w:pPr>
       <w:r>
@@ -72,7 +72,7 @@
     </w:p>
     <w:p>
       <w:pPr>
-        <w:spacing w:after="100"/>
+        <w:spacing w:after="60"/>
         <w:jc w:val="center"/>
       </w:pPr>
       <w:r>
@@ -107,7 +107,7 @@
           <w:bottom w:val="single" w:color="BFBFBF" w:sz="4" w:space="2"/>
           <w:left w:val="single" w:color="1F4E79" w:sz="24" w:space="6"/>
         </w:pBdr>
-        <w:spacing w:after="80" w:before="200"/>
+        <w:spacing w:after="80" w:before="160"/>
       </w:pPr>
       <w:r>
         <w:rPr>
@@ -118,94 +118,537 @@
           <w:sz w:val="24"/>
           <w:szCs w:val="24"/>
         </w:rPr>
-        <w:t xml:space="preserve">講師紹介</w:t>
+        <w:t xml:space="preserve">講師プロフィール</w:t>
       </w:r>
     </w:p>
-    <w:p>
-      <w:pPr>
-        <w:spacing w:after="40" w:line="276"/>
-      </w:pPr>
-      <w:r>
-        <w:rPr>
-          <w:rFonts w:ascii="Yu Gothic" w:eastAsia="Yu Gothic" w:hAnsi="Yu Gothic"/>
-          <w:b/>
-          <w:bCs/>
-          <w:sz w:val="22"/>
-          <w:szCs w:val="22"/>
-        </w:rPr>
-        <w:t xml:space="preserve">【氏名】</w:t>
-      </w:r>
-      <w:r>
-        <w:rPr>
-          <w:rFonts w:ascii="Yu Gothic" w:eastAsia="Yu Gothic" w:hAnsi="Yu Gothic"/>
-          <w:color w:val="595959"/>
-          <w:sz w:val="20"/>
-          <w:szCs w:val="20"/>
-        </w:rPr>
-        <w:t xml:space="preserve">　ファイナンシャルプランナー</w:t>
-      </w:r>
-    </w:p>
-    <w:p>
-      <w:pPr>
-        <w:pStyle w:val="ListParagraph"/>
-        <w:numPr>
-          <w:ilvl w:val="0"/>
-          <w:numId w:val="2"/>
-        </w:numPr>
-        <w:spacing w:after="30" w:line="276"/>
-      </w:pPr>
-      <w:r>
-        <w:rPr>
-          <w:rFonts w:ascii="Yu Gothic" w:eastAsia="Yu Gothic" w:hAnsi="Yu Gothic"/>
-          <w:sz w:val="20"/>
-          <w:szCs w:val="20"/>
-        </w:rPr>
-        <w:t xml:space="preserve">看護師・保健師・介護支援専門員（ケアマネジャー）として医療・介護の現場を経験</w:t>
-      </w:r>
-    </w:p>
-    <w:p>
-      <w:pPr>
-        <w:pStyle w:val="ListParagraph"/>
-        <w:numPr>
-          <w:ilvl w:val="0"/>
-          <w:numId w:val="2"/>
-        </w:numPr>
-        <w:spacing w:after="30" w:line="276"/>
-      </w:pPr>
-      <w:r>
-        <w:rPr>
-          <w:rFonts w:ascii="Yu Gothic" w:eastAsia="Yu Gothic" w:hAnsi="Yu Gothic"/>
-          <w:sz w:val="20"/>
-          <w:szCs w:val="20"/>
-        </w:rPr>
-        <w:t xml:space="preserve">現在は生命保険・損害保険・資産運用の専門家として、個人・法人のライフプランづくりを支援</w:t>
-      </w:r>
-    </w:p>
-    <w:p>
-      <w:pPr>
-        <w:pStyle w:val="ListParagraph"/>
-        <w:numPr>
-          <w:ilvl w:val="0"/>
-          <w:numId w:val="2"/>
-        </w:numPr>
-        <w:spacing w:after="30" w:line="276"/>
-      </w:pPr>
-      <w:r>
-        <w:rPr>
-          <w:rFonts w:ascii="Yu Gothic" w:eastAsia="Yu Gothic" w:hAnsi="Yu Gothic"/>
-          <w:sz w:val="20"/>
-          <w:szCs w:val="20"/>
-        </w:rPr>
-        <w:t xml:space="preserve">「現場の言葉で、お金と備えをわかりやすく」がモットー</w:t>
-      </w:r>
-    </w:p>
+    <w:tbl>
+      <w:tblPr>
+        <w:tblW w:type="dxa" w:w="10206"/>
+        <w:tblBorders>
+          <w:top w:val="single" w:color="auto" w:sz="4"/>
+          <w:left w:val="single" w:color="auto" w:sz="4"/>
+          <w:bottom w:val="single" w:color="auto" w:sz="4"/>
+          <w:right w:val="single" w:color="auto" w:sz="4"/>
+          <w:insideH w:val="single" w:color="auto" w:sz="4"/>
+          <w:insideV w:val="single" w:color="auto" w:sz="4"/>
+        </w:tblBorders>
+      </w:tblPr>
+      <w:tblGrid>
+        <w:gridCol w:w="1600"/>
+        <w:gridCol w:w="1300"/>
+        <w:gridCol w:w="7306"/>
+      </w:tblGrid>
+      <w:tr>
+        <w:tc>
+          <w:tcPr>
+            <w:tcW w:type="dxa" w:w="1600"/>
+            <w:vMerge w:val="restart"/>
+            <w:tcBorders>
+              <w:top w:val="single" w:color="BFBFBF" w:sz="4"/>
+              <w:left w:val="single" w:color="BFBFBF" w:sz="4"/>
+              <w:bottom w:val="single" w:color="BFBFBF" w:sz="4"/>
+              <w:right w:val="single" w:color="BFBFBF" w:sz="4"/>
+            </w:tcBorders>
+            <w:shd w:fill="F2F2F2" w:color="auto" w:val="clear"/>
+            <w:tcMar>
+              <w:top w:type="dxa" w:w="40"/>
+              <w:left w:type="dxa" w:w="100"/>
+              <w:bottom w:type="dxa" w:w="40"/>
+              <w:right w:type="dxa" w:w="100"/>
+            </w:tcMar>
+            <w:vAlign w:val="center"/>
+          </w:tcPr>
+          <w:p>
+            <w:pPr>
+              <w:spacing w:after="0" w:line="260"/>
+              <w:jc w:val="center"/>
+            </w:pPr>
+            <w:r>
+              <w:rPr>
+                <w:rFonts w:ascii="Yu Gothic" w:eastAsia="Yu Gothic" w:hAnsi="Yu Gothic"/>
+                <w:color w:val="595959"/>
+                <w:sz w:val="18"/>
+                <w:szCs w:val="18"/>
+              </w:rPr>
+              <w:t xml:space="preserve">写真</w:t>
+            </w:r>
+          </w:p>
+        </w:tc>
+        <w:tc>
+          <w:tcPr>
+            <w:tcW w:type="dxa" w:w="8606"/>
+            <w:gridSpan w:val="2"/>
+            <w:tcBorders>
+              <w:top w:val="single" w:color="BFBFBF" w:sz="4"/>
+              <w:left w:val="single" w:color="BFBFBF" w:sz="4"/>
+              <w:bottom w:val="single" w:color="BFBFBF" w:sz="4"/>
+              <w:right w:val="single" w:color="BFBFBF" w:sz="4"/>
+            </w:tcBorders>
+            <w:shd w:fill="DEEAF6" w:color="auto" w:val="clear"/>
+            <w:tcMar>
+              <w:top w:type="dxa" w:w="40"/>
+              <w:left w:type="dxa" w:w="100"/>
+              <w:bottom w:type="dxa" w:w="40"/>
+              <w:right w:type="dxa" w:w="100"/>
+            </w:tcMar>
+            <w:vAlign w:val="center"/>
+          </w:tcPr>
+          <w:p>
+            <w:pPr>
+              <w:spacing w:after="0" w:line="260"/>
+            </w:pPr>
+            <w:r>
+              <w:rPr>
+                <w:rFonts w:ascii="Yu Gothic" w:eastAsia="Yu Gothic" w:hAnsi="Yu Gothic"/>
+                <w:b/>
+                <w:bCs/>
+                <w:sz w:val="22"/>
+                <w:szCs w:val="22"/>
+              </w:rPr>
+              <w:t xml:space="preserve">【氏名】</w:t>
+            </w:r>
+            <w:r>
+              <w:rPr>
+                <w:rFonts w:ascii="Yu Gothic" w:eastAsia="Yu Gothic" w:hAnsi="Yu Gothic"/>
+                <w:color w:val="595959"/>
+                <w:sz w:val="18"/>
+                <w:szCs w:val="18"/>
+              </w:rPr>
+              <w:t xml:space="preserve">　ファイナンシャルプランナー</w:t>
+            </w:r>
+          </w:p>
+        </w:tc>
+      </w:tr>
+      <w:tr>
+        <w:tc>
+          <w:tcPr>
+            <w:vMerge w:val="continue"/>
+            <w:tcBorders>
+              <w:top w:val="single" w:color="BFBFBF" w:sz="4"/>
+              <w:left w:val="single" w:color="BFBFBF" w:sz="4"/>
+              <w:bottom w:val="single" w:color="BFBFBF" w:sz="4"/>
+              <w:right w:val="single" w:color="BFBFBF" w:sz="4"/>
+            </w:tcBorders>
+          </w:tcPr>
+          <w:p/>
+        </w:tc>
+        <w:tc>
+          <w:tcPr>
+            <w:tcW w:type="dxa" w:w="1300"/>
+            <w:tcBorders>
+              <w:top w:val="single" w:color="BFBFBF" w:sz="4"/>
+              <w:left w:val="single" w:color="BFBFBF" w:sz="4"/>
+              <w:bottom w:val="single" w:color="BFBFBF" w:sz="4"/>
+              <w:right w:val="single" w:color="BFBFBF" w:sz="4"/>
+            </w:tcBorders>
+            <w:tcMar>
+              <w:top w:type="dxa" w:w="40"/>
+              <w:left w:type="dxa" w:w="100"/>
+              <w:bottom w:type="dxa" w:w="40"/>
+              <w:right w:type="dxa" w:w="100"/>
+            </w:tcMar>
+            <w:vAlign w:val="center"/>
+          </w:tcPr>
+          <w:p>
+            <w:pPr>
+              <w:spacing w:after="0" w:line="260"/>
+            </w:pPr>
+            <w:r>
+              <w:rPr>
+                <w:rFonts w:ascii="Yu Gothic" w:eastAsia="Yu Gothic" w:hAnsi="Yu Gothic"/>
+                <w:b/>
+                <w:bCs/>
+                <w:color w:val="1F4E79"/>
+                <w:sz w:val="18"/>
+                <w:szCs w:val="18"/>
+              </w:rPr>
+              <w:t xml:space="preserve">保有資格</w:t>
+            </w:r>
+          </w:p>
+        </w:tc>
+        <w:tc>
+          <w:tcPr>
+            <w:tcW w:type="dxa" w:w="7306"/>
+            <w:tcBorders>
+              <w:top w:val="single" w:color="BFBFBF" w:sz="4"/>
+              <w:left w:val="single" w:color="BFBFBF" w:sz="4"/>
+              <w:bottom w:val="single" w:color="BFBFBF" w:sz="4"/>
+              <w:right w:val="single" w:color="BFBFBF" w:sz="4"/>
+            </w:tcBorders>
+            <w:tcMar>
+              <w:top w:type="dxa" w:w="40"/>
+              <w:left w:type="dxa" w:w="100"/>
+              <w:bottom w:type="dxa" w:w="40"/>
+              <w:right w:type="dxa" w:w="100"/>
+            </w:tcMar>
+            <w:vAlign w:val="center"/>
+          </w:tcPr>
+          <w:p>
+            <w:pPr>
+              <w:spacing w:after="0" w:line="260"/>
+            </w:pPr>
+            <w:r>
+              <w:rPr>
+                <w:rFonts w:ascii="Yu Gothic" w:eastAsia="Yu Gothic" w:hAnsi="Yu Gothic"/>
+                <w:sz w:val="18"/>
+                <w:szCs w:val="18"/>
+              </w:rPr>
+              <w:t xml:space="preserve">看護師／保健師／介護支援専門員（ケアマネジャー）／ファイナンシャルプランナー</w:t>
+            </w:r>
+            <w:r>
+              <w:rPr>
+                <w:rFonts w:ascii="Yu Gothic" w:eastAsia="Yu Gothic" w:hAnsi="Yu Gothic"/>
+                <w:color w:val="595959"/>
+                <w:sz w:val="18"/>
+                <w:szCs w:val="18"/>
+              </w:rPr>
+              <w:t xml:space="preserve">【FP資格名・級】</w:t>
+            </w:r>
+          </w:p>
+        </w:tc>
+      </w:tr>
+      <w:tr>
+        <w:tc>
+          <w:tcPr>
+            <w:vMerge w:val="continue"/>
+            <w:tcBorders>
+              <w:top w:val="single" w:color="BFBFBF" w:sz="4"/>
+              <w:left w:val="single" w:color="BFBFBF" w:sz="4"/>
+              <w:bottom w:val="single" w:color="BFBFBF" w:sz="4"/>
+              <w:right w:val="single" w:color="BFBFBF" w:sz="4"/>
+            </w:tcBorders>
+          </w:tcPr>
+          <w:p/>
+        </w:tc>
+        <w:tc>
+          <w:tcPr>
+            <w:tcW w:type="dxa" w:w="1300"/>
+            <w:tcBorders>
+              <w:top w:val="single" w:color="BFBFBF" w:sz="4"/>
+              <w:left w:val="single" w:color="BFBFBF" w:sz="4"/>
+              <w:bottom w:val="single" w:color="BFBFBF" w:sz="4"/>
+              <w:right w:val="single" w:color="BFBFBF" w:sz="4"/>
+            </w:tcBorders>
+            <w:tcMar>
+              <w:top w:type="dxa" w:w="40"/>
+              <w:left w:type="dxa" w:w="100"/>
+              <w:bottom w:type="dxa" w:w="40"/>
+              <w:right w:type="dxa" w:w="100"/>
+            </w:tcMar>
+            <w:vAlign w:val="center"/>
+          </w:tcPr>
+          <w:p>
+            <w:pPr>
+              <w:spacing w:after="0" w:line="260"/>
+            </w:pPr>
+            <w:r>
+              <w:rPr>
+                <w:rFonts w:ascii="Yu Gothic" w:eastAsia="Yu Gothic" w:hAnsi="Yu Gothic"/>
+                <w:b/>
+                <w:bCs/>
+                <w:color w:val="1F4E79"/>
+                <w:sz w:val="18"/>
+                <w:szCs w:val="18"/>
+              </w:rPr>
+              <w:t xml:space="preserve">経歴</w:t>
+            </w:r>
+          </w:p>
+        </w:tc>
+        <w:tc>
+          <w:tcPr>
+            <w:tcW w:type="dxa" w:w="7306"/>
+            <w:tcBorders>
+              <w:top w:val="single" w:color="BFBFBF" w:sz="4"/>
+              <w:left w:val="single" w:color="BFBFBF" w:sz="4"/>
+              <w:bottom w:val="single" w:color="BFBFBF" w:sz="4"/>
+              <w:right w:val="single" w:color="BFBFBF" w:sz="4"/>
+            </w:tcBorders>
+            <w:tcMar>
+              <w:top w:type="dxa" w:w="40"/>
+              <w:left w:type="dxa" w:w="100"/>
+              <w:bottom w:type="dxa" w:w="40"/>
+              <w:right w:type="dxa" w:w="100"/>
+            </w:tcMar>
+            <w:vAlign w:val="center"/>
+          </w:tcPr>
+          <w:p>
+            <w:pPr>
+              <w:spacing w:after="0" w:line="260"/>
+            </w:pPr>
+            <w:r>
+              <w:rPr>
+                <w:rFonts w:ascii="Yu Gothic" w:eastAsia="Yu Gothic" w:hAnsi="Yu Gothic"/>
+                <w:sz w:val="18"/>
+                <w:szCs w:val="18"/>
+              </w:rPr>
+              <w:t xml:space="preserve">看護師・保健師・ケアマネジャーとして医療・介護の現場に従事</w:t>
+            </w:r>
+            <w:r>
+              <w:rPr>
+                <w:rFonts w:ascii="Yu Gothic" w:eastAsia="Yu Gothic" w:hAnsi="Yu Gothic"/>
+                <w:color w:val="595959"/>
+                <w:sz w:val="18"/>
+                <w:szCs w:val="18"/>
+              </w:rPr>
+              <w:t xml:space="preserve">【分野・年数】</w:t>
+            </w:r>
+            <w:r>
+              <w:rPr>
+                <w:rFonts w:ascii="Yu Gothic" w:eastAsia="Yu Gothic" w:hAnsi="Yu Gothic"/>
+                <w:sz w:val="18"/>
+                <w:szCs w:val="18"/>
+              </w:rPr>
+              <w:t xml:space="preserve">。現在は生命保険・損害保険・金融商品仲介業（IFA）として、個人・法人のライフプランニングを支援</w:t>
+            </w:r>
+          </w:p>
+        </w:tc>
+      </w:tr>
+      <w:tr>
+        <w:tc>
+          <w:tcPr>
+            <w:vMerge w:val="continue"/>
+            <w:tcBorders>
+              <w:top w:val="single" w:color="BFBFBF" w:sz="4"/>
+              <w:left w:val="single" w:color="BFBFBF" w:sz="4"/>
+              <w:bottom w:val="single" w:color="BFBFBF" w:sz="4"/>
+              <w:right w:val="single" w:color="BFBFBF" w:sz="4"/>
+            </w:tcBorders>
+          </w:tcPr>
+          <w:p/>
+        </w:tc>
+        <w:tc>
+          <w:tcPr>
+            <w:tcW w:type="dxa" w:w="1300"/>
+            <w:tcBorders>
+              <w:top w:val="single" w:color="BFBFBF" w:sz="4"/>
+              <w:left w:val="single" w:color="BFBFBF" w:sz="4"/>
+              <w:bottom w:val="single" w:color="BFBFBF" w:sz="4"/>
+              <w:right w:val="single" w:color="BFBFBF" w:sz="4"/>
+            </w:tcBorders>
+            <w:tcMar>
+              <w:top w:type="dxa" w:w="40"/>
+              <w:left w:type="dxa" w:w="100"/>
+              <w:bottom w:type="dxa" w:w="40"/>
+              <w:right w:type="dxa" w:w="100"/>
+            </w:tcMar>
+            <w:vAlign w:val="center"/>
+          </w:tcPr>
+          <w:p>
+            <w:pPr>
+              <w:spacing w:after="0" w:line="260"/>
+            </w:pPr>
+            <w:r>
+              <w:rPr>
+                <w:rFonts w:ascii="Yu Gothic" w:eastAsia="Yu Gothic" w:hAnsi="Yu Gothic"/>
+                <w:b/>
+                <w:bCs/>
+                <w:color w:val="1F4E79"/>
+                <w:sz w:val="18"/>
+                <w:szCs w:val="18"/>
+              </w:rPr>
+              <w:t xml:space="preserve">専門分野</w:t>
+            </w:r>
+          </w:p>
+        </w:tc>
+        <w:tc>
+          <w:tcPr>
+            <w:tcW w:type="dxa" w:w="7306"/>
+            <w:tcBorders>
+              <w:top w:val="single" w:color="BFBFBF" w:sz="4"/>
+              <w:left w:val="single" w:color="BFBFBF" w:sz="4"/>
+              <w:bottom w:val="single" w:color="BFBFBF" w:sz="4"/>
+              <w:right w:val="single" w:color="BFBFBF" w:sz="4"/>
+            </w:tcBorders>
+            <w:tcMar>
+              <w:top w:type="dxa" w:w="40"/>
+              <w:left w:type="dxa" w:w="100"/>
+              <w:bottom w:type="dxa" w:w="40"/>
+              <w:right w:type="dxa" w:w="100"/>
+            </w:tcMar>
+            <w:vAlign w:val="center"/>
+          </w:tcPr>
+          <w:p>
+            <w:pPr>
+              <w:spacing w:after="0" w:line="260"/>
+            </w:pPr>
+            <w:r>
+              <w:rPr>
+                <w:rFonts w:ascii="Yu Gothic" w:eastAsia="Yu Gothic" w:hAnsi="Yu Gothic"/>
+                <w:sz w:val="18"/>
+                <w:szCs w:val="18"/>
+              </w:rPr>
+              <w:t xml:space="preserve">医療・介護とお金、社会保障制度、ライフプランニング、保険・資産形成</w:t>
+            </w:r>
+          </w:p>
+        </w:tc>
+      </w:tr>
+      <w:tr>
+        <w:tc>
+          <w:tcPr>
+            <w:vMerge w:val="continue"/>
+            <w:tcBorders>
+              <w:top w:val="single" w:color="BFBFBF" w:sz="4"/>
+              <w:left w:val="single" w:color="BFBFBF" w:sz="4"/>
+              <w:bottom w:val="single" w:color="BFBFBF" w:sz="4"/>
+              <w:right w:val="single" w:color="BFBFBF" w:sz="4"/>
+            </w:tcBorders>
+          </w:tcPr>
+          <w:p/>
+        </w:tc>
+        <w:tc>
+          <w:tcPr>
+            <w:tcW w:type="dxa" w:w="1300"/>
+            <w:tcBorders>
+              <w:top w:val="single" w:color="BFBFBF" w:sz="4"/>
+              <w:left w:val="single" w:color="BFBFBF" w:sz="4"/>
+              <w:bottom w:val="single" w:color="BFBFBF" w:sz="4"/>
+              <w:right w:val="single" w:color="BFBFBF" w:sz="4"/>
+            </w:tcBorders>
+            <w:tcMar>
+              <w:top w:type="dxa" w:w="40"/>
+              <w:left w:type="dxa" w:w="100"/>
+              <w:bottom w:type="dxa" w:w="40"/>
+              <w:right w:type="dxa" w:w="100"/>
+            </w:tcMar>
+            <w:vAlign w:val="center"/>
+          </w:tcPr>
+          <w:p>
+            <w:pPr>
+              <w:spacing w:after="0" w:line="260"/>
+            </w:pPr>
+            <w:r>
+              <w:rPr>
+                <w:rFonts w:ascii="Yu Gothic" w:eastAsia="Yu Gothic" w:hAnsi="Yu Gothic"/>
+                <w:b/>
+                <w:bCs/>
+                <w:color w:val="1F4E79"/>
+                <w:sz w:val="18"/>
+                <w:szCs w:val="18"/>
+              </w:rPr>
+              <w:t xml:space="preserve">講師実績</w:t>
+            </w:r>
+          </w:p>
+        </w:tc>
+        <w:tc>
+          <w:tcPr>
+            <w:tcW w:type="dxa" w:w="7306"/>
+            <w:tcBorders>
+              <w:top w:val="single" w:color="BFBFBF" w:sz="4"/>
+              <w:left w:val="single" w:color="BFBFBF" w:sz="4"/>
+              <w:bottom w:val="single" w:color="BFBFBF" w:sz="4"/>
+              <w:right w:val="single" w:color="BFBFBF" w:sz="4"/>
+            </w:tcBorders>
+            <w:tcMar>
+              <w:top w:type="dxa" w:w="40"/>
+              <w:left w:type="dxa" w:w="100"/>
+              <w:bottom w:type="dxa" w:w="40"/>
+              <w:right w:type="dxa" w:w="100"/>
+            </w:tcMar>
+            <w:vAlign w:val="center"/>
+          </w:tcPr>
+          <w:p>
+            <w:pPr>
+              <w:spacing w:after="0" w:line="260"/>
+            </w:pPr>
+            <w:r>
+              <w:rPr>
+                <w:rFonts w:ascii="Yu Gothic" w:eastAsia="Yu Gothic" w:hAnsi="Yu Gothic"/>
+                <w:color w:val="595959"/>
+                <w:sz w:val="18"/>
+                <w:szCs w:val="18"/>
+              </w:rPr>
+              <w:t xml:space="preserve">【セミナー・研修の実績】</w:t>
+            </w:r>
+          </w:p>
+        </w:tc>
+      </w:tr>
+      <w:tr>
+        <w:tc>
+          <w:tcPr>
+            <w:vMerge w:val="continue"/>
+            <w:tcBorders>
+              <w:top w:val="single" w:color="BFBFBF" w:sz="4"/>
+              <w:left w:val="single" w:color="BFBFBF" w:sz="4"/>
+              <w:bottom w:val="single" w:color="BFBFBF" w:sz="4"/>
+              <w:right w:val="single" w:color="BFBFBF" w:sz="4"/>
+            </w:tcBorders>
+          </w:tcPr>
+          <w:p/>
+        </w:tc>
+        <w:tc>
+          <w:tcPr>
+            <w:tcW w:type="dxa" w:w="1300"/>
+            <w:tcBorders>
+              <w:top w:val="single" w:color="BFBFBF" w:sz="4"/>
+              <w:left w:val="single" w:color="BFBFBF" w:sz="4"/>
+              <w:bottom w:val="single" w:color="BFBFBF" w:sz="4"/>
+              <w:right w:val="single" w:color="BFBFBF" w:sz="4"/>
+            </w:tcBorders>
+            <w:tcMar>
+              <w:top w:type="dxa" w:w="40"/>
+              <w:left w:type="dxa" w:w="100"/>
+              <w:bottom w:type="dxa" w:w="40"/>
+              <w:right w:type="dxa" w:w="100"/>
+            </w:tcMar>
+            <w:vAlign w:val="center"/>
+          </w:tcPr>
+          <w:p>
+            <w:pPr>
+              <w:spacing w:after="0" w:line="260"/>
+            </w:pPr>
+            <w:r>
+              <w:rPr>
+                <w:rFonts w:ascii="Yu Gothic" w:eastAsia="Yu Gothic" w:hAnsi="Yu Gothic"/>
+                <w:b/>
+                <w:bCs/>
+                <w:color w:val="1F4E79"/>
+                <w:sz w:val="18"/>
+                <w:szCs w:val="18"/>
+              </w:rPr>
+              <w:t xml:space="preserve">メッセージ</w:t>
+            </w:r>
+          </w:p>
+        </w:tc>
+        <w:tc>
+          <w:tcPr>
+            <w:tcW w:type="dxa" w:w="7306"/>
+            <w:tcBorders>
+              <w:top w:val="single" w:color="BFBFBF" w:sz="4"/>
+              <w:left w:val="single" w:color="BFBFBF" w:sz="4"/>
+              <w:bottom w:val="single" w:color="BFBFBF" w:sz="4"/>
+              <w:right w:val="single" w:color="BFBFBF" w:sz="4"/>
+            </w:tcBorders>
+            <w:tcMar>
+              <w:top w:type="dxa" w:w="40"/>
+              <w:left w:type="dxa" w:w="100"/>
+              <w:bottom w:type="dxa" w:w="40"/>
+              <w:right w:type="dxa" w:w="100"/>
+            </w:tcMar>
+            <w:vAlign w:val="center"/>
+          </w:tcPr>
+          <w:p>
+            <w:pPr>
+              <w:spacing w:after="0" w:line="260"/>
+            </w:pPr>
+            <w:r>
+              <w:rPr>
+                <w:rFonts w:ascii="Yu Gothic" w:eastAsia="Yu Gothic" w:hAnsi="Yu Gothic"/>
+                <w:sz w:val="18"/>
+                <w:szCs w:val="18"/>
+              </w:rPr>
+              <w:t xml:space="preserve">「現場の言葉で、お金と備えをわかりやすく」。看護・介護の現場を知る立場から、職員の皆さまとご家族の暮らしの安心づくりをお手伝いします。</w:t>
+            </w:r>
+          </w:p>
+        </w:tc>
+      </w:tr>
+    </w:tbl>
     <w:p>
       <w:pPr>
         <w:pBdr>
           <w:bottom w:val="single" w:color="BFBFBF" w:sz="4" w:space="2"/>
           <w:left w:val="single" w:color="1F4E79" w:sz="24" w:space="6"/>
         </w:pBdr>
-        <w:spacing w:after="80" w:before="200"/>
+        <w:spacing w:after="80" w:before="160"/>
       </w:pPr>
       <w:r>
         <w:rPr>
@@ -252,9 +695,9 @@
             </w:tcBorders>
             <w:shd w:fill="1F4E79" w:color="auto" w:val="clear"/>
             <w:tcMar>
-              <w:top w:type="dxa" w:w="70"/>
-              <w:left w:type="dxa" w:w="110"/>
-              <w:bottom w:type="dxa" w:w="70"/>
+              <w:top w:type="dxa" w:w="50"/>
+              <w:left w:type="dxa" w:w="110"/>
+              <w:bottom w:type="dxa" w:w="50"/>
               <w:right w:type="dxa" w:w="110"/>
             </w:tcMar>
             <w:vAlign w:val="center"/>
@@ -288,9 +731,9 @@
             </w:tcBorders>
             <w:shd w:fill="1F4E79" w:color="auto" w:val="clear"/>
             <w:tcMar>
-              <w:top w:type="dxa" w:w="70"/>
-              <w:left w:type="dxa" w:w="110"/>
-              <w:bottom w:type="dxa" w:w="70"/>
+              <w:top w:type="dxa" w:w="50"/>
+              <w:left w:type="dxa" w:w="110"/>
+              <w:bottom w:type="dxa" w:w="50"/>
               <w:right w:type="dxa" w:w="110"/>
             </w:tcMar>
             <w:vAlign w:val="center"/>
@@ -324,9 +767,9 @@
             </w:tcBorders>
             <w:shd w:fill="1F4E79" w:color="auto" w:val="clear"/>
             <w:tcMar>
-              <w:top w:type="dxa" w:w="70"/>
-              <w:left w:type="dxa" w:w="110"/>
-              <w:bottom w:type="dxa" w:w="70"/>
+              <w:top w:type="dxa" w:w="50"/>
+              <w:left w:type="dxa" w:w="110"/>
+              <w:bottom w:type="dxa" w:w="50"/>
               <w:right w:type="dxa" w:w="110"/>
             </w:tcMar>
             <w:vAlign w:val="center"/>
@@ -360,9 +803,9 @@
             </w:tcBorders>
             <w:shd w:fill="1F4E79" w:color="auto" w:val="clear"/>
             <w:tcMar>
-              <w:top w:type="dxa" w:w="70"/>
-              <w:left w:type="dxa" w:w="110"/>
-              <w:bottom w:type="dxa" w:w="70"/>
+              <w:top w:type="dxa" w:w="50"/>
+              <w:left w:type="dxa" w:w="110"/>
+              <w:bottom w:type="dxa" w:w="50"/>
               <w:right w:type="dxa" w:w="110"/>
             </w:tcMar>
             <w:vAlign w:val="center"/>
@@ -398,9 +841,9 @@
             </w:tcBorders>
             <w:shd w:fill="F2F7FC" w:color="auto" w:val="clear"/>
             <w:tcMar>
-              <w:top w:type="dxa" w:w="70"/>
-              <w:left w:type="dxa" w:w="110"/>
-              <w:bottom w:type="dxa" w:w="70"/>
+              <w:top w:type="dxa" w:w="50"/>
+              <w:left w:type="dxa" w:w="110"/>
+              <w:bottom w:type="dxa" w:w="50"/>
               <w:right w:type="dxa" w:w="110"/>
             </w:tcMar>
             <w:vAlign w:val="center"/>
@@ -434,9 +877,9 @@
             </w:tcBorders>
             <w:shd w:fill="F2F7FC" w:color="auto" w:val="clear"/>
             <w:tcMar>
-              <w:top w:type="dxa" w:w="70"/>
-              <w:left w:type="dxa" w:w="110"/>
-              <w:bottom w:type="dxa" w:w="70"/>
+              <w:top w:type="dxa" w:w="50"/>
+              <w:left w:type="dxa" w:w="110"/>
+              <w:bottom w:type="dxa" w:w="50"/>
               <w:right w:type="dxa" w:w="110"/>
             </w:tcMar>
             <w:vAlign w:val="center"/>
@@ -469,9 +912,9 @@
             </w:tcBorders>
             <w:shd w:fill="F2F7FC" w:color="auto" w:val="clear"/>
             <w:tcMar>
-              <w:top w:type="dxa" w:w="70"/>
-              <w:left w:type="dxa" w:w="110"/>
-              <w:bottom w:type="dxa" w:w="70"/>
+              <w:top w:type="dxa" w:w="50"/>
+              <w:left w:type="dxa" w:w="110"/>
+              <w:bottom w:type="dxa" w:w="50"/>
               <w:right w:type="dxa" w:w="110"/>
             </w:tcMar>
             <w:vAlign w:val="center"/>
@@ -502,9 +945,9 @@
             </w:tcBorders>
             <w:shd w:fill="F2F7FC" w:color="auto" w:val="clear"/>
             <w:tcMar>
-              <w:top w:type="dxa" w:w="70"/>
-              <w:left w:type="dxa" w:w="110"/>
-              <w:bottom w:type="dxa" w:w="70"/>
+              <w:top w:type="dxa" w:w="50"/>
+              <w:left w:type="dxa" w:w="110"/>
+              <w:bottom w:type="dxa" w:w="50"/>
               <w:right w:type="dxa" w:w="110"/>
             </w:tcMar>
             <w:vAlign w:val="center"/>
@@ -536,9 +979,9 @@
               <w:right w:val="single" w:color="BFBFBF" w:sz="4"/>
             </w:tcBorders>
             <w:tcMar>
-              <w:top w:type="dxa" w:w="70"/>
-              <w:left w:type="dxa" w:w="110"/>
-              <w:bottom w:type="dxa" w:w="70"/>
+              <w:top w:type="dxa" w:w="50"/>
+              <w:left w:type="dxa" w:w="110"/>
+              <w:bottom w:type="dxa" w:w="50"/>
               <w:right w:type="dxa" w:w="110"/>
             </w:tcMar>
             <w:vAlign w:val="center"/>
@@ -571,9 +1014,9 @@
               <w:right w:val="single" w:color="BFBFBF" w:sz="4"/>
             </w:tcBorders>
             <w:tcMar>
-              <w:top w:type="dxa" w:w="70"/>
-              <w:left w:type="dxa" w:w="110"/>
-              <w:bottom w:type="dxa" w:w="70"/>
+              <w:top w:type="dxa" w:w="50"/>
+              <w:left w:type="dxa" w:w="110"/>
+              <w:bottom w:type="dxa" w:w="50"/>
               <w:right w:type="dxa" w:w="110"/>
             </w:tcMar>
             <w:vAlign w:val="center"/>
@@ -605,9 +1048,9 @@
               <w:right w:val="single" w:color="BFBFBF" w:sz="4"/>
             </w:tcBorders>
             <w:tcMar>
-              <w:top w:type="dxa" w:w="70"/>
-              <w:left w:type="dxa" w:w="110"/>
-              <w:bottom w:type="dxa" w:w="70"/>
+              <w:top w:type="dxa" w:w="50"/>
+              <w:left w:type="dxa" w:w="110"/>
+              <w:bottom w:type="dxa" w:w="50"/>
               <w:right w:type="dxa" w:w="110"/>
             </w:tcMar>
             <w:vAlign w:val="center"/>
@@ -637,9 +1080,9 @@
               <w:right w:val="single" w:color="BFBFBF" w:sz="4"/>
             </w:tcBorders>
             <w:tcMar>
-              <w:top w:type="dxa" w:w="70"/>
-              <w:left w:type="dxa" w:w="110"/>
-              <w:bottom w:type="dxa" w:w="70"/>
+              <w:top w:type="dxa" w:w="50"/>
+              <w:left w:type="dxa" w:w="110"/>
+              <w:bottom w:type="dxa" w:w="50"/>
               <w:right w:type="dxa" w:w="110"/>
             </w:tcMar>
             <w:vAlign w:val="center"/>
@@ -672,9 +1115,9 @@
             </w:tcBorders>
             <w:shd w:fill="F2F7FC" w:color="auto" w:val="clear"/>
             <w:tcMar>
-              <w:top w:type="dxa" w:w="70"/>
-              <w:left w:type="dxa" w:w="110"/>
-              <w:bottom w:type="dxa" w:w="70"/>
+              <w:top w:type="dxa" w:w="50"/>
+              <w:left w:type="dxa" w:w="110"/>
+              <w:bottom w:type="dxa" w:w="50"/>
               <w:right w:type="dxa" w:w="110"/>
             </w:tcMar>
             <w:vAlign w:val="center"/>
@@ -708,9 +1151,9 @@
             </w:tcBorders>
             <w:shd w:fill="F2F7FC" w:color="auto" w:val="clear"/>
             <w:tcMar>
-              <w:top w:type="dxa" w:w="70"/>
-              <w:left w:type="dxa" w:w="110"/>
-              <w:bottom w:type="dxa" w:w="70"/>
+              <w:top w:type="dxa" w:w="50"/>
+              <w:left w:type="dxa" w:w="110"/>
+              <w:bottom w:type="dxa" w:w="50"/>
               <w:right w:type="dxa" w:w="110"/>
             </w:tcMar>
             <w:vAlign w:val="center"/>
@@ -743,9 +1186,9 @@
             </w:tcBorders>
             <w:shd w:fill="F2F7FC" w:color="auto" w:val="clear"/>
             <w:tcMar>
-              <w:top w:type="dxa" w:w="70"/>
-              <w:left w:type="dxa" w:w="110"/>
-              <w:bottom w:type="dxa" w:w="70"/>
+              <w:top w:type="dxa" w:w="50"/>
+              <w:left w:type="dxa" w:w="110"/>
+              <w:bottom w:type="dxa" w:w="50"/>
               <w:right w:type="dxa" w:w="110"/>
             </w:tcMar>
             <w:vAlign w:val="center"/>
@@ -776,9 +1219,9 @@
             </w:tcBorders>
             <w:shd w:fill="F2F7FC" w:color="auto" w:val="clear"/>
             <w:tcMar>
-              <w:top w:type="dxa" w:w="70"/>
-              <w:left w:type="dxa" w:w="110"/>
-              <w:bottom w:type="dxa" w:w="70"/>
+              <w:top w:type="dxa" w:w="50"/>
+              <w:left w:type="dxa" w:w="110"/>
+              <w:bottom w:type="dxa" w:w="50"/>
               <w:right w:type="dxa" w:w="110"/>
             </w:tcMar>
             <w:vAlign w:val="center"/>
@@ -810,9 +1253,9 @@
               <w:right w:val="single" w:color="BFBFBF" w:sz="4"/>
             </w:tcBorders>
             <w:tcMar>
-              <w:top w:type="dxa" w:w="70"/>
-              <w:left w:type="dxa" w:w="110"/>
-              <w:bottom w:type="dxa" w:w="70"/>
+              <w:top w:type="dxa" w:w="50"/>
+              <w:left w:type="dxa" w:w="110"/>
+              <w:bottom w:type="dxa" w:w="50"/>
               <w:right w:type="dxa" w:w="110"/>
             </w:tcMar>
             <w:vAlign w:val="center"/>
@@ -845,9 +1288,9 @@
               <w:right w:val="single" w:color="BFBFBF" w:sz="4"/>
             </w:tcBorders>
             <w:tcMar>
-              <w:top w:type="dxa" w:w="70"/>
-              <w:left w:type="dxa" w:w="110"/>
-              <w:bottom w:type="dxa" w:w="70"/>
+              <w:top w:type="dxa" w:w="50"/>
+              <w:left w:type="dxa" w:w="110"/>
+              <w:bottom w:type="dxa" w:w="50"/>
               <w:right w:type="dxa" w:w="110"/>
             </w:tcMar>
             <w:vAlign w:val="center"/>
@@ -879,9 +1322,9 @@
               <w:right w:val="single" w:color="BFBFBF" w:sz="4"/>
             </w:tcBorders>
             <w:tcMar>
-              <w:top w:type="dxa" w:w="70"/>
-              <w:left w:type="dxa" w:w="110"/>
-              <w:bottom w:type="dxa" w:w="70"/>
+              <w:top w:type="dxa" w:w="50"/>
+              <w:left w:type="dxa" w:w="110"/>
+              <w:bottom w:type="dxa" w:w="50"/>
               <w:right w:type="dxa" w:w="110"/>
             </w:tcMar>
             <w:vAlign w:val="center"/>
@@ -911,9 +1354,9 @@
               <w:right w:val="single" w:color="BFBFBF" w:sz="4"/>
             </w:tcBorders>
             <w:tcMar>
-              <w:top w:type="dxa" w:w="70"/>
-              <w:left w:type="dxa" w:w="110"/>
-              <w:bottom w:type="dxa" w:w="70"/>
+              <w:top w:type="dxa" w:w="50"/>
+              <w:left w:type="dxa" w:w="110"/>
+              <w:bottom w:type="dxa" w:w="50"/>
               <w:right w:type="dxa" w:w="110"/>
             </w:tcMar>
             <w:vAlign w:val="center"/>
@@ -955,7 +1398,7 @@
           <w:bottom w:val="single" w:color="BFBFBF" w:sz="4" w:space="2"/>
           <w:left w:val="single" w:color="1F4E79" w:sz="24" w:space="6"/>
         </w:pBdr>
-        <w:spacing w:after="80" w:before="200"/>
+        <w:spacing w:after="80" w:before="160"/>
       </w:pPr>
       <w:r>
         <w:rPr>
@@ -976,7 +1419,7 @@
           <w:ilvl w:val="0"/>
           <w:numId w:val="2"/>
         </w:numPr>
-        <w:spacing w:after="30" w:line="276"/>
+        <w:spacing w:after="20" w:line="264"/>
       </w:pPr>
       <w:r>
         <w:rPr>
@@ -1004,7 +1447,7 @@
           <w:ilvl w:val="0"/>
           <w:numId w:val="2"/>
         </w:numPr>
-        <w:spacing w:after="30" w:line="276"/>
+        <w:spacing w:after="20" w:line="264"/>
       </w:pPr>
       <w:r>
         <w:rPr>
@@ -1022,7 +1465,7 @@
           <w:ilvl w:val="0"/>
           <w:numId w:val="2"/>
         </w:numPr>
-        <w:spacing w:after="30" w:line="276"/>
+        <w:spacing w:after="20" w:line="264"/>
       </w:pPr>
       <w:r>
         <w:rPr>
@@ -1040,7 +1483,7 @@
           <w:ilvl w:val="0"/>
           <w:numId w:val="2"/>
         </w:numPr>
-        <w:spacing w:after="30" w:line="276"/>
+        <w:spacing w:after="20" w:line="264"/>
       </w:pPr>
       <w:r>
         <w:rPr>
@@ -1057,7 +1500,7 @@
           <w:bottom w:val="single" w:color="BFBFBF" w:sz="4" w:space="2"/>
           <w:left w:val="single" w:color="1F4E79" w:sz="24" w:space="6"/>
         </w:pBdr>
-        <w:spacing w:after="80" w:before="200"/>
+        <w:spacing w:after="80" w:before="160"/>
       </w:pPr>
       <w:r>
         <w:rPr>
@@ -1099,9 +1542,9 @@
             </w:tcBorders>
             <w:shd w:fill="DEEAF6" w:color="auto" w:val="clear"/>
             <w:tcMar>
-              <w:top w:type="dxa" w:w="70"/>
-              <w:left w:type="dxa" w:w="110"/>
-              <w:bottom w:type="dxa" w:w="70"/>
+              <w:top w:type="dxa" w:w="50"/>
+              <w:left w:type="dxa" w:w="110"/>
+              <w:bottom w:type="dxa" w:w="50"/>
               <w:right w:type="dxa" w:w="110"/>
             </w:tcMar>
             <w:vAlign w:val="center"/>
@@ -1132,9 +1575,9 @@
               <w:right w:val="single" w:color="BFBFBF" w:sz="4"/>
             </w:tcBorders>
             <w:tcMar>
-              <w:top w:type="dxa" w:w="70"/>
-              <w:left w:type="dxa" w:w="110"/>
-              <w:bottom w:type="dxa" w:w="70"/>
+              <w:top w:type="dxa" w:w="50"/>
+              <w:left w:type="dxa" w:w="110"/>
+              <w:bottom w:type="dxa" w:w="50"/>
               <w:right w:type="dxa" w:w="110"/>
             </w:tcMar>
             <w:vAlign w:val="center"/>
@@ -1166,9 +1609,9 @@
             </w:tcBorders>
             <w:shd w:fill="DEEAF6" w:color="auto" w:val="clear"/>
             <w:tcMar>
-              <w:top w:type="dxa" w:w="70"/>
-              <w:left w:type="dxa" w:w="110"/>
-              <w:bottom w:type="dxa" w:w="70"/>
+              <w:top w:type="dxa" w:w="50"/>
+              <w:left w:type="dxa" w:w="110"/>
+              <w:bottom w:type="dxa" w:w="50"/>
               <w:right w:type="dxa" w:w="110"/>
             </w:tcMar>
             <w:vAlign w:val="center"/>
@@ -1199,9 +1642,9 @@
               <w:right w:val="single" w:color="BFBFBF" w:sz="4"/>
             </w:tcBorders>
             <w:tcMar>
-              <w:top w:type="dxa" w:w="70"/>
-              <w:left w:type="dxa" w:w="110"/>
-              <w:bottom w:type="dxa" w:w="70"/>
+              <w:top w:type="dxa" w:w="50"/>
+              <w:left w:type="dxa" w:w="110"/>
+              <w:bottom w:type="dxa" w:w="50"/>
               <w:right w:type="dxa" w:w="110"/>
             </w:tcMar>
             <w:vAlign w:val="center"/>
@@ -1233,9 +1676,9 @@
             </w:tcBorders>
             <w:shd w:fill="DEEAF6" w:color="auto" w:val="clear"/>
             <w:tcMar>
-              <w:top w:type="dxa" w:w="70"/>
-              <w:left w:type="dxa" w:w="110"/>
-              <w:bottom w:type="dxa" w:w="70"/>
+              <w:top w:type="dxa" w:w="50"/>
+              <w:left w:type="dxa" w:w="110"/>
+              <w:bottom w:type="dxa" w:w="50"/>
               <w:right w:type="dxa" w:w="110"/>
             </w:tcMar>
             <w:vAlign w:val="center"/>
@@ -1266,9 +1709,9 @@
               <w:right w:val="single" w:color="BFBFBF" w:sz="4"/>
             </w:tcBorders>
             <w:tcMar>
-              <w:top w:type="dxa" w:w="70"/>
-              <w:left w:type="dxa" w:w="110"/>
-              <w:bottom w:type="dxa" w:w="70"/>
+              <w:top w:type="dxa" w:w="50"/>
+              <w:left w:type="dxa" w:w="110"/>
+              <w:bottom w:type="dxa" w:w="50"/>
               <w:right w:type="dxa" w:w="110"/>
             </w:tcMar>
             <w:vAlign w:val="center"/>
@@ -1300,9 +1743,9 @@
             </w:tcBorders>
             <w:shd w:fill="DEEAF6" w:color="auto" w:val="clear"/>
             <w:tcMar>
-              <w:top w:type="dxa" w:w="70"/>
-              <w:left w:type="dxa" w:w="110"/>
-              <w:bottom w:type="dxa" w:w="70"/>
+              <w:top w:type="dxa" w:w="50"/>
+              <w:left w:type="dxa" w:w="110"/>
+              <w:bottom w:type="dxa" w:w="50"/>
               <w:right w:type="dxa" w:w="110"/>
             </w:tcMar>
             <w:vAlign w:val="center"/>
@@ -1333,9 +1776,9 @@
               <w:right w:val="single" w:color="BFBFBF" w:sz="4"/>
             </w:tcBorders>
             <w:tcMar>
-              <w:top w:type="dxa" w:w="70"/>
-              <w:left w:type="dxa" w:w="110"/>
-              <w:bottom w:type="dxa" w:w="70"/>
+              <w:top w:type="dxa" w:w="50"/>
+              <w:left w:type="dxa" w:w="110"/>
+              <w:bottom w:type="dxa" w:w="50"/>
               <w:right w:type="dxa" w:w="110"/>
             </w:tcMar>
             <w:vAlign w:val="center"/>
@@ -1372,7 +1815,7 @@
     </w:p>
     <w:sectPr>
       <w:pgSz w:w="11906" w:h="16838" w:orient="portrait"/>
-      <w:pgMar w:top="850" w:right="850" w:bottom="680" w:left="850" w:header="708" w:footer="708" w:gutter="0"/>
+      <w:pgMar w:top="794" w:right="850" w:bottom="624" w:left="850" w:header="708" w:footer="708" w:gutter="0"/>
       <w:pgNumType/>
       <w:docGrid w:linePitch="360"/>
     </w:sectPr>

</xml_diff>

<commit_message>
Add instructor photo to proposal and flyer
Co-Authored-By: Claude Opus 5.5 <noreply@anthropic.com>
Claude-Session: https://claude.ai/code/session_01ASU6ETCN5Sbt1bh9wzP5YS
</commit_message>
<xml_diff>
--- a/勉強会チラシ_施設向け.docx
+++ b/勉強会チラシ_施設向け.docx
@@ -149,28 +149,58 @@
               <w:bottom w:val="single" w:color="BFBFBF" w:sz="4"/>
               <w:right w:val="single" w:color="BFBFBF" w:sz="4"/>
             </w:tcBorders>
-            <w:shd w:fill="F2F2F2" w:color="auto" w:val="clear"/>
-            <w:tcMar>
-              <w:top w:type="dxa" w:w="40"/>
+            <w:tcMar>
+              <w:top w:type="dxa" w:w="25"/>
               <w:left w:type="dxa" w:w="100"/>
-              <w:bottom w:type="dxa" w:w="40"/>
+              <w:bottom w:type="dxa" w:w="25"/>
               <w:right w:type="dxa" w:w="100"/>
             </w:tcMar>
             <w:vAlign w:val="center"/>
           </w:tcPr>
           <w:p>
             <w:pPr>
-              <w:spacing w:after="0" w:line="260"/>
+              <w:spacing w:after="0"/>
               <w:jc w:val="center"/>
             </w:pPr>
             <w:r>
-              <w:rPr>
-                <w:rFonts w:ascii="Yu Gothic" w:eastAsia="Yu Gothic" w:hAnsi="Yu Gothic"/>
-                <w:color w:val="595959"/>
-                <w:sz w:val="18"/>
-                <w:szCs w:val="18"/>
-              </w:rPr>
-              <w:t xml:space="preserve">写真</w:t>
+              <w:drawing>
+                <wp:inline distT="0" distB="0" distL="0" distR="0">
+                  <wp:extent cx="838200" cy="1114425"/>
+                  <wp:effectExtent t="0" r="0" b="0" l="0"/>
+                  <wp:docPr id="1" name="" descr="" title=""/>
+                  <wp:cNvGraphicFramePr>
+                    <a:graphicFrameLocks xmlns:a="http://schemas.openxmlformats.org/drawingml/2006/main" noChangeAspect="1"/>
+                  </wp:cNvGraphicFramePr>
+                  <a:graphic xmlns:a="http://schemas.openxmlformats.org/drawingml/2006/main">
+                    <a:graphicData uri="http://schemas.openxmlformats.org/drawingml/2006/picture">
+                      <pic:pic xmlns:pic="http://schemas.openxmlformats.org/drawingml/2006/picture">
+                        <pic:nvPicPr>
+                          <pic:cNvPr id="0" name="" descr=""/>
+                          <pic:cNvPicPr>
+                            <a:picLocks noChangeAspect="1" noChangeArrowheads="1"/>
+                          </pic:cNvPicPr>
+                        </pic:nvPicPr>
+                        <pic:blipFill>
+                          <a:blip r:embed="rId7" cstate="none"/>
+                          <a:srcRect/>
+                          <a:stretch>
+                            <a:fillRect/>
+                          </a:stretch>
+                        </pic:blipFill>
+                        <pic:spPr bwMode="auto">
+                          <a:xfrm>
+                            <a:off x="0" y="0"/>
+                            <a:ext cx="838200" cy="1114425"/>
+                          </a:xfrm>
+                          <a:prstGeom prst="rect">
+                            <a:avLst/>
+                          </a:prstGeom>
+                        </pic:spPr>
+                      </pic:pic>
+                    </a:graphicData>
+                  </a:graphic>
+                </wp:inline>
+              </w:drawing>
             </w:r>
           </w:p>
         </w:tc>
@@ -186,9 +216,9 @@
             </w:tcBorders>
             <w:shd w:fill="DEEAF6" w:color="auto" w:val="clear"/>
             <w:tcMar>
-              <w:top w:type="dxa" w:w="40"/>
+              <w:top w:type="dxa" w:w="25"/>
               <w:left w:type="dxa" w:w="100"/>
-              <w:bottom w:type="dxa" w:w="40"/>
+              <w:bottom w:type="dxa" w:w="25"/>
               <w:right w:type="dxa" w:w="100"/>
             </w:tcMar>
             <w:vAlign w:val="center"/>
@@ -242,9 +272,9 @@
               <w:right w:val="single" w:color="BFBFBF" w:sz="4"/>
             </w:tcBorders>
             <w:tcMar>
-              <w:top w:type="dxa" w:w="40"/>
+              <w:top w:type="dxa" w:w="25"/>
               <w:left w:type="dxa" w:w="100"/>
-              <w:bottom w:type="dxa" w:w="40"/>
+              <w:bottom w:type="dxa" w:w="25"/>
               <w:right w:type="dxa" w:w="100"/>
             </w:tcMar>
             <w:vAlign w:val="center"/>
@@ -276,9 +306,9 @@
               <w:right w:val="single" w:color="BFBFBF" w:sz="4"/>
             </w:tcBorders>
             <w:tcMar>
-              <w:top w:type="dxa" w:w="40"/>
+              <w:top w:type="dxa" w:w="25"/>
               <w:left w:type="dxa" w:w="100"/>
-              <w:bottom w:type="dxa" w:w="40"/>
+              <w:bottom w:type="dxa" w:w="25"/>
               <w:right w:type="dxa" w:w="100"/>
             </w:tcMar>
             <w:vAlign w:val="center"/>
@@ -330,9 +360,9 @@
               <w:right w:val="single" w:color="BFBFBF" w:sz="4"/>
             </w:tcBorders>
             <w:tcMar>
-              <w:top w:type="dxa" w:w="40"/>
+              <w:top w:type="dxa" w:w="25"/>
               <w:left w:type="dxa" w:w="100"/>
-              <w:bottom w:type="dxa" w:w="40"/>
+              <w:bottom w:type="dxa" w:w="25"/>
               <w:right w:type="dxa" w:w="100"/>
             </w:tcMar>
             <w:vAlign w:val="center"/>
@@ -364,9 +394,9 @@
               <w:right w:val="single" w:color="BFBFBF" w:sz="4"/>
             </w:tcBorders>
             <w:tcMar>
-              <w:top w:type="dxa" w:w="40"/>
+              <w:top w:type="dxa" w:w="25"/>
               <w:left w:type="dxa" w:w="100"/>
-              <w:bottom w:type="dxa" w:w="40"/>
+              <w:bottom w:type="dxa" w:w="25"/>
               <w:right w:type="dxa" w:w="100"/>
             </w:tcMar>
             <w:vAlign w:val="center"/>
@@ -426,9 +456,9 @@
               <w:right w:val="single" w:color="BFBFBF" w:sz="4"/>
             </w:tcBorders>
             <w:tcMar>
-              <w:top w:type="dxa" w:w="40"/>
+              <w:top w:type="dxa" w:w="25"/>
               <w:left w:type="dxa" w:w="100"/>
-              <w:bottom w:type="dxa" w:w="40"/>
+              <w:bottom w:type="dxa" w:w="25"/>
               <w:right w:type="dxa" w:w="100"/>
             </w:tcMar>
             <w:vAlign w:val="center"/>
@@ -460,9 +490,9 @@
               <w:right w:val="single" w:color="BFBFBF" w:sz="4"/>
             </w:tcBorders>
             <w:tcMar>
-              <w:top w:type="dxa" w:w="40"/>
+              <w:top w:type="dxa" w:w="25"/>
               <w:left w:type="dxa" w:w="100"/>
-              <w:bottom w:type="dxa" w:w="40"/>
+              <w:bottom w:type="dxa" w:w="25"/>
               <w:right w:type="dxa" w:w="100"/>
             </w:tcMar>
             <w:vAlign w:val="center"/>
@@ -505,9 +535,9 @@
               <w:right w:val="single" w:color="BFBFBF" w:sz="4"/>
             </w:tcBorders>
             <w:tcMar>
-              <w:top w:type="dxa" w:w="40"/>
+              <w:top w:type="dxa" w:w="25"/>
               <w:left w:type="dxa" w:w="100"/>
-              <w:bottom w:type="dxa" w:w="40"/>
+              <w:bottom w:type="dxa" w:w="25"/>
               <w:right w:type="dxa" w:w="100"/>
             </w:tcMar>
             <w:vAlign w:val="center"/>
@@ -539,9 +569,9 @@
               <w:right w:val="single" w:color="BFBFBF" w:sz="4"/>
             </w:tcBorders>
             <w:tcMar>
-              <w:top w:type="dxa" w:w="40"/>
+              <w:top w:type="dxa" w:w="25"/>
               <w:left w:type="dxa" w:w="100"/>
-              <w:bottom w:type="dxa" w:w="40"/>
+              <w:bottom w:type="dxa" w:w="25"/>
               <w:right w:type="dxa" w:w="100"/>
             </w:tcMar>
             <w:vAlign w:val="center"/>
@@ -585,9 +615,9 @@
               <w:right w:val="single" w:color="BFBFBF" w:sz="4"/>
             </w:tcBorders>
             <w:tcMar>
-              <w:top w:type="dxa" w:w="40"/>
+              <w:top w:type="dxa" w:w="25"/>
               <w:left w:type="dxa" w:w="100"/>
-              <w:bottom w:type="dxa" w:w="40"/>
+              <w:bottom w:type="dxa" w:w="25"/>
               <w:right w:type="dxa" w:w="100"/>
             </w:tcMar>
             <w:vAlign w:val="center"/>
@@ -619,9 +649,9 @@
               <w:right w:val="single" w:color="BFBFBF" w:sz="4"/>
             </w:tcBorders>
             <w:tcMar>
-              <w:top w:type="dxa" w:w="40"/>
+              <w:top w:type="dxa" w:w="25"/>
               <w:left w:type="dxa" w:w="100"/>
-              <w:bottom w:type="dxa" w:w="40"/>
+              <w:bottom w:type="dxa" w:w="25"/>
               <w:right w:type="dxa" w:w="100"/>
             </w:tcMar>
             <w:vAlign w:val="center"/>

</xml_diff>

<commit_message>
Use exact line spacing so proposal and flyer fit one A4 page in Word
Co-Authored-By: Claude Opus 5.5 <noreply@anthropic.com>
Claude-Session: https://claude.ai/code/session_01ASU6ETCN5Sbt1bh9wzP5YS
</commit_message>
<xml_diff>
--- a/勉強会チラシ_施設向け.docx
+++ b/勉強会チラシ_施設向け.docx
@@ -4,7 +4,7 @@
   <w:body>
     <w:p>
       <w:pPr>
-        <w:spacing w:after="60"/>
+        <w:spacing w:after="60" w:line="270" w:lineRule="exact"/>
         <w:jc w:val="center"/>
       </w:pPr>
       <w:r>
@@ -20,7 +20,7 @@
     <w:p>
       <w:pPr>
         <w:shd w:fill="1F4E79" w:color="auto" w:val="clear"/>
-        <w:spacing w:after="0" w:before="40"/>
+        <w:spacing w:after="0" w:before="40" w:line="500" w:lineRule="exact"/>
         <w:jc w:val="center"/>
       </w:pPr>
       <w:r>
@@ -38,7 +38,7 @@
     <w:p>
       <w:pPr>
         <w:shd w:fill="1F4E79" w:color="auto" w:val="clear"/>
-        <w:spacing w:after="100" w:before="0"/>
+        <w:spacing w:after="100" w:before="0" w:line="600" w:lineRule="exact"/>
         <w:jc w:val="center"/>
       </w:pPr>
       <w:r>
@@ -55,7 +55,7 @@
     </w:p>
     <w:p>
       <w:pPr>
-        <w:spacing w:after="20"/>
+        <w:spacing w:after="20" w:line="360" w:lineRule="exact"/>
         <w:jc w:val="center"/>
       </w:pPr>
       <w:r>
@@ -72,7 +72,7 @@
     </w:p>
     <w:p>
       <w:pPr>
-        <w:spacing w:after="60"/>
+        <w:spacing w:after="60" w:line="400" w:lineRule="exact"/>
         <w:jc w:val="center"/>
       </w:pPr>
       <w:r>
@@ -89,7 +89,7 @@
     </w:p>
     <w:p>
       <w:pPr>
-        <w:spacing w:after="40" w:line="276"/>
+        <w:spacing w:after="40" w:line="270" w:lineRule="exact"/>
         <w:jc w:val="center"/>
       </w:pPr>
       <w:r>
@@ -107,7 +107,7 @@
           <w:bottom w:val="single" w:color="BFBFBF" w:sz="4" w:space="2"/>
           <w:left w:val="single" w:color="1F4E79" w:sz="24" w:space="6"/>
         </w:pBdr>
-        <w:spacing w:after="80" w:before="160"/>
+        <w:spacing w:after="80" w:before="160" w:line="340" w:lineRule="exact"/>
       </w:pPr>
       <w:r>
         <w:rPr>
@@ -159,7 +159,7 @@
           </w:tcPr>
           <w:p>
             <w:pPr>
-              <w:spacing w:after="0"/>
+              <w:spacing w:after="0" w:line="240" w:lineRule="auto"/>
               <w:jc w:val="center"/>
             </w:pPr>
             <w:r>
@@ -225,7 +225,7 @@
           </w:tcPr>
           <w:p>
             <w:pPr>
-              <w:spacing w:after="0" w:line="260"/>
+              <w:spacing w:after="0" w:line="250" w:lineRule="exact"/>
             </w:pPr>
             <w:r>
               <w:rPr>
@@ -281,7 +281,7 @@
           </w:tcPr>
           <w:p>
             <w:pPr>
-              <w:spacing w:after="0" w:line="260"/>
+              <w:spacing w:after="0" w:line="250" w:lineRule="exact"/>
             </w:pPr>
             <w:r>
               <w:rPr>
@@ -315,7 +315,7 @@
           </w:tcPr>
           <w:p>
             <w:pPr>
-              <w:spacing w:after="0" w:line="260"/>
+              <w:spacing w:after="0" w:line="250" w:lineRule="exact"/>
             </w:pPr>
             <w:r>
               <w:rPr>
@@ -369,7 +369,7 @@
           </w:tcPr>
           <w:p>
             <w:pPr>
-              <w:spacing w:after="0" w:line="260"/>
+              <w:spacing w:after="0" w:line="250" w:lineRule="exact"/>
             </w:pPr>
             <w:r>
               <w:rPr>
@@ -403,7 +403,7 @@
           </w:tcPr>
           <w:p>
             <w:pPr>
-              <w:spacing w:after="0" w:line="260"/>
+              <w:spacing w:after="0" w:line="250" w:lineRule="exact"/>
             </w:pPr>
             <w:r>
               <w:rPr>
@@ -465,7 +465,7 @@
           </w:tcPr>
           <w:p>
             <w:pPr>
-              <w:spacing w:after="0" w:line="260"/>
+              <w:spacing w:after="0" w:line="250" w:lineRule="exact"/>
             </w:pPr>
             <w:r>
               <w:rPr>
@@ -499,7 +499,7 @@
           </w:tcPr>
           <w:p>
             <w:pPr>
-              <w:spacing w:after="0" w:line="260"/>
+              <w:spacing w:after="0" w:line="250" w:lineRule="exact"/>
             </w:pPr>
             <w:r>
               <w:rPr>
@@ -544,7 +544,7 @@
           </w:tcPr>
           <w:p>
             <w:pPr>
-              <w:spacing w:after="0" w:line="260"/>
+              <w:spacing w:after="0" w:line="250" w:lineRule="exact"/>
             </w:pPr>
             <w:r>
               <w:rPr>
@@ -578,7 +578,7 @@
           </w:tcPr>
           <w:p>
             <w:pPr>
-              <w:spacing w:after="0" w:line="260"/>
+              <w:spacing w:after="0" w:line="250" w:lineRule="exact"/>
             </w:pPr>
             <w:r>
               <w:rPr>
@@ -624,7 +624,7 @@
           </w:tcPr>
           <w:p>
             <w:pPr>
-              <w:spacing w:after="0" w:line="260"/>
+              <w:spacing w:after="0" w:line="250" w:lineRule="exact"/>
             </w:pPr>
             <w:r>
               <w:rPr>
@@ -658,7 +658,7 @@
           </w:tcPr>
           <w:p>
             <w:pPr>
-              <w:spacing w:after="0" w:line="260"/>
+              <w:spacing w:after="0" w:line="250" w:lineRule="exact"/>
             </w:pPr>
             <w:r>
               <w:rPr>
@@ -678,7 +678,7 @@
           <w:bottom w:val="single" w:color="BFBFBF" w:sz="4" w:space="2"/>
           <w:left w:val="single" w:color="1F4E79" w:sz="24" w:space="6"/>
         </w:pBdr>
-        <w:spacing w:after="80" w:before="160"/>
+        <w:spacing w:after="80" w:before="160" w:line="340" w:lineRule="exact"/>
       </w:pPr>
       <w:r>
         <w:rPr>
@@ -734,7 +734,7 @@
           </w:tcPr>
           <w:p>
             <w:pPr>
-              <w:spacing w:after="0"/>
+              <w:spacing w:after="0" w:line="270" w:lineRule="exact"/>
               <w:jc w:val="center"/>
             </w:pPr>
             <w:r>
@@ -770,7 +770,7 @@
           </w:tcPr>
           <w:p>
             <w:pPr>
-              <w:spacing w:after="0"/>
+              <w:spacing w:after="0" w:line="270" w:lineRule="exact"/>
               <w:jc w:val="center"/>
             </w:pPr>
             <w:r>
@@ -806,7 +806,7 @@
           </w:tcPr>
           <w:p>
             <w:pPr>
-              <w:spacing w:after="0"/>
+              <w:spacing w:after="0" w:line="270" w:lineRule="exact"/>
               <w:jc w:val="center"/>
             </w:pPr>
             <w:r>
@@ -842,7 +842,7 @@
           </w:tcPr>
           <w:p>
             <w:pPr>
-              <w:spacing w:after="0"/>
+              <w:spacing w:after="0" w:line="270" w:lineRule="exact"/>
               <w:jc w:val="center"/>
             </w:pPr>
             <w:r>
@@ -880,7 +880,7 @@
           </w:tcPr>
           <w:p>
             <w:pPr>
-              <w:spacing w:after="0"/>
+              <w:spacing w:after="0" w:line="270" w:lineRule="exact"/>
               <w:jc w:val="center"/>
             </w:pPr>
             <w:r>
@@ -916,7 +916,7 @@
           </w:tcPr>
           <w:p>
             <w:pPr>
-              <w:spacing w:after="0"/>
+              <w:spacing w:after="0" w:line="270" w:lineRule="exact"/>
               <w:jc w:val="left"/>
             </w:pPr>
             <w:r>
@@ -951,7 +951,7 @@
           </w:tcPr>
           <w:p>
             <w:pPr>
-              <w:spacing w:after="0"/>
+              <w:spacing w:after="0" w:line="270" w:lineRule="exact"/>
               <w:jc w:val="left"/>
             </w:pPr>
             <w:r>
@@ -984,7 +984,7 @@
           </w:tcPr>
           <w:p>
             <w:pPr>
-              <w:spacing w:after="0"/>
+              <w:spacing w:after="0" w:line="270" w:lineRule="exact"/>
               <w:jc w:val="center"/>
             </w:pPr>
             <w:r>
@@ -1018,7 +1018,7 @@
           </w:tcPr>
           <w:p>
             <w:pPr>
-              <w:spacing w:after="0"/>
+              <w:spacing w:after="0" w:line="270" w:lineRule="exact"/>
               <w:jc w:val="center"/>
             </w:pPr>
             <w:r>
@@ -1053,7 +1053,7 @@
           </w:tcPr>
           <w:p>
             <w:pPr>
-              <w:spacing w:after="0"/>
+              <w:spacing w:after="0" w:line="270" w:lineRule="exact"/>
               <w:jc w:val="left"/>
             </w:pPr>
             <w:r>
@@ -1087,7 +1087,7 @@
           </w:tcPr>
           <w:p>
             <w:pPr>
-              <w:spacing w:after="0"/>
+              <w:spacing w:after="0" w:line="270" w:lineRule="exact"/>
               <w:jc w:val="left"/>
             </w:pPr>
             <w:r>
@@ -1119,7 +1119,7 @@
           </w:tcPr>
           <w:p>
             <w:pPr>
-              <w:spacing w:after="0"/>
+              <w:spacing w:after="0" w:line="270" w:lineRule="exact"/>
               <w:jc w:val="center"/>
             </w:pPr>
             <w:r>
@@ -1154,7 +1154,7 @@
           </w:tcPr>
           <w:p>
             <w:pPr>
-              <w:spacing w:after="0"/>
+              <w:spacing w:after="0" w:line="270" w:lineRule="exact"/>
               <w:jc w:val="center"/>
             </w:pPr>
             <w:r>
@@ -1190,7 +1190,7 @@
           </w:tcPr>
           <w:p>
             <w:pPr>
-              <w:spacing w:after="0"/>
+              <w:spacing w:after="0" w:line="270" w:lineRule="exact"/>
               <w:jc w:val="left"/>
             </w:pPr>
             <w:r>
@@ -1225,7 +1225,7 @@
           </w:tcPr>
           <w:p>
             <w:pPr>
-              <w:spacing w:after="0"/>
+              <w:spacing w:after="0" w:line="270" w:lineRule="exact"/>
               <w:jc w:val="left"/>
             </w:pPr>
             <w:r>
@@ -1258,7 +1258,7 @@
           </w:tcPr>
           <w:p>
             <w:pPr>
-              <w:spacing w:after="0"/>
+              <w:spacing w:after="0" w:line="270" w:lineRule="exact"/>
               <w:jc w:val="center"/>
             </w:pPr>
             <w:r>
@@ -1292,7 +1292,7 @@
           </w:tcPr>
           <w:p>
             <w:pPr>
-              <w:spacing w:after="0"/>
+              <w:spacing w:after="0" w:line="270" w:lineRule="exact"/>
               <w:jc w:val="center"/>
             </w:pPr>
             <w:r>
@@ -1327,7 +1327,7 @@
           </w:tcPr>
           <w:p>
             <w:pPr>
-              <w:spacing w:after="0"/>
+              <w:spacing w:after="0" w:line="270" w:lineRule="exact"/>
               <w:jc w:val="left"/>
             </w:pPr>
             <w:r>
@@ -1361,7 +1361,7 @@
           </w:tcPr>
           <w:p>
             <w:pPr>
-              <w:spacing w:after="0"/>
+              <w:spacing w:after="0" w:line="270" w:lineRule="exact"/>
               <w:jc w:val="left"/>
             </w:pPr>
             <w:r>
@@ -1393,7 +1393,7 @@
           </w:tcPr>
           <w:p>
             <w:pPr>
-              <w:spacing w:after="0"/>
+              <w:spacing w:after="0" w:line="270" w:lineRule="exact"/>
               <w:jc w:val="center"/>
             </w:pPr>
             <w:r>
@@ -1410,7 +1410,7 @@
     </w:tbl>
     <w:p>
       <w:pPr>
-        <w:spacing w:before="40"/>
+        <w:spacing w:after="40" w:before="40" w:line="270" w:lineRule="exact"/>
       </w:pPr>
       <w:r>
         <w:rPr>
@@ -1428,7 +1428,7 @@
           <w:bottom w:val="single" w:color="BFBFBF" w:sz="4" w:space="2"/>
           <w:left w:val="single" w:color="1F4E79" w:sz="24" w:space="6"/>
         </w:pBdr>
-        <w:spacing w:after="80" w:before="160"/>
+        <w:spacing w:after="80" w:before="160" w:line="340" w:lineRule="exact"/>
       </w:pPr>
       <w:r>
         <w:rPr>
@@ -1449,7 +1449,7 @@
           <w:ilvl w:val="0"/>
           <w:numId w:val="2"/>
         </w:numPr>
-        <w:spacing w:after="20" w:line="264"/>
+        <w:spacing w:after="20" w:line="260" w:lineRule="exact"/>
       </w:pPr>
       <w:r>
         <w:rPr>
@@ -1477,7 +1477,7 @@
           <w:ilvl w:val="0"/>
           <w:numId w:val="2"/>
         </w:numPr>
-        <w:spacing w:after="20" w:line="264"/>
+        <w:spacing w:after="20" w:line="260" w:lineRule="exact"/>
       </w:pPr>
       <w:r>
         <w:rPr>
@@ -1495,7 +1495,7 @@
           <w:ilvl w:val="0"/>
           <w:numId w:val="2"/>
         </w:numPr>
-        <w:spacing w:after="20" w:line="264"/>
+        <w:spacing w:after="20" w:line="260" w:lineRule="exact"/>
       </w:pPr>
       <w:r>
         <w:rPr>
@@ -1513,7 +1513,7 @@
           <w:ilvl w:val="0"/>
           <w:numId w:val="2"/>
         </w:numPr>
-        <w:spacing w:after="20" w:line="264"/>
+        <w:spacing w:after="20" w:line="260" w:lineRule="exact"/>
       </w:pPr>
       <w:r>
         <w:rPr>
@@ -1530,7 +1530,7 @@
           <w:bottom w:val="single" w:color="BFBFBF" w:sz="4" w:space="2"/>
           <w:left w:val="single" w:color="1F4E79" w:sz="24" w:space="6"/>
         </w:pBdr>
-        <w:spacing w:after="80" w:before="160"/>
+        <w:spacing w:after="80" w:before="160" w:line="340" w:lineRule="exact"/>
       </w:pPr>
       <w:r>
         <w:rPr>
@@ -1581,7 +1581,7 @@
           </w:tcPr>
           <w:p>
             <w:pPr>
-              <w:spacing w:after="0"/>
+              <w:spacing w:after="0" w:line="270" w:lineRule="exact"/>
             </w:pPr>
             <w:r>
               <w:rPr>
@@ -1614,7 +1614,7 @@
           </w:tcPr>
           <w:p>
             <w:pPr>
-              <w:spacing w:after="0"/>
+              <w:spacing w:after="0" w:line="270" w:lineRule="exact"/>
             </w:pPr>
             <w:r>
               <w:rPr>
@@ -1648,7 +1648,7 @@
           </w:tcPr>
           <w:p>
             <w:pPr>
-              <w:spacing w:after="0"/>
+              <w:spacing w:after="0" w:line="270" w:lineRule="exact"/>
             </w:pPr>
             <w:r>
               <w:rPr>
@@ -1681,7 +1681,7 @@
           </w:tcPr>
           <w:p>
             <w:pPr>
-              <w:spacing w:after="0"/>
+              <w:spacing w:after="0" w:line="270" w:lineRule="exact"/>
             </w:pPr>
             <w:r>
               <w:rPr>
@@ -1715,7 +1715,7 @@
           </w:tcPr>
           <w:p>
             <w:pPr>
-              <w:spacing w:after="0"/>
+              <w:spacing w:after="0" w:line="270" w:lineRule="exact"/>
             </w:pPr>
             <w:r>
               <w:rPr>
@@ -1748,7 +1748,7 @@
           </w:tcPr>
           <w:p>
             <w:pPr>
-              <w:spacing w:after="0"/>
+              <w:spacing w:after="0" w:line="270" w:lineRule="exact"/>
             </w:pPr>
             <w:r>
               <w:rPr>
@@ -1782,7 +1782,7 @@
           </w:tcPr>
           <w:p>
             <w:pPr>
-              <w:spacing w:after="0"/>
+              <w:spacing w:after="0" w:line="270" w:lineRule="exact"/>
             </w:pPr>
             <w:r>
               <w:rPr>
@@ -1815,7 +1815,7 @@
           </w:tcPr>
           <w:p>
             <w:pPr>
-              <w:spacing w:after="0"/>
+              <w:spacing w:after="0" w:line="270" w:lineRule="exact"/>
             </w:pPr>
             <w:r>
               <w:rPr>
@@ -1831,7 +1831,7 @@
     </w:tbl>
     <w:p>
       <w:pPr>
-        <w:spacing w:before="40"/>
+        <w:spacing w:after="40" w:before="40" w:line="270" w:lineRule="exact"/>
       </w:pPr>
       <w:r>
         <w:rPr>

</xml_diff>

<commit_message>
Fill in instructor name and qualifications
Co-Authored-By: Claude Opus 5.5 <noreply@anthropic.com>
Claude-Session: https://claude.ai/code/session_01ASU6ETCN5Sbt1bh9wzP5YS
</commit_message>
<xml_diff>
--- a/勉強会チラシ_施設向け.docx
+++ b/勉強会チラシ_施設向け.docx
@@ -235,7 +235,15 @@
                 <w:sz w:val="22"/>
                 <w:szCs w:val="22"/>
               </w:rPr>
-              <w:t xml:space="preserve">【氏名】</w:t>
+              <w:t xml:space="preserve">小野 健汰</w:t>
+            </w:r>
+            <w:r>
+              <w:rPr>
+                <w:rFonts w:ascii="Yu Gothic" w:eastAsia="Yu Gothic" w:hAnsi="Yu Gothic"/>
+                <w:sz w:val="17"/>
+                <w:szCs w:val="17"/>
+              </w:rPr>
+              <w:t xml:space="preserve">（おの けんた）</w:t>
             </w:r>
             <w:r>
               <w:rPr>
@@ -323,16 +331,7 @@
                 <w:sz w:val="18"/>
                 <w:szCs w:val="18"/>
               </w:rPr>
-              <w:t xml:space="preserve">看護師／保健師／介護支援専門員（ケアマネジャー）／ファイナンシャルプランナー</w:t>
-            </w:r>
-            <w:r>
-              <w:rPr>
-                <w:rFonts w:ascii="Yu Gothic" w:eastAsia="Yu Gothic" w:hAnsi="Yu Gothic"/>
-                <w:color w:val="595959"/>
-                <w:sz w:val="18"/>
-                <w:szCs w:val="18"/>
-              </w:rPr>
-              <w:t xml:space="preserve">【FP資格名・級】</w:t>
+              <w:t xml:space="preserve">看護師／保健師／介護支援専門員（ケアマネジャー）／相続診断士／ファイナンシャルプランナー2級／住宅ローンアドバイザー／こどものお金先生</w:t>
             </w:r>
           </w:p>
         </w:tc>
@@ -507,7 +506,7 @@
                 <w:sz w:val="18"/>
                 <w:szCs w:val="18"/>
               </w:rPr>
-              <w:t xml:space="preserve">医療・介護とお金、社会保障制度、ライフプランニング、保険・資産形成</w:t>
+              <w:t xml:space="preserve">医療・介護とお金、社会保障制度、相続、住宅ローン、こどものお金、ライフプランニング、保険・資産形成</w:t>
             </w:r>
           </w:p>
         </w:tc>
@@ -1622,7 +1621,7 @@
                 <w:sz w:val="20"/>
                 <w:szCs w:val="20"/>
               </w:rPr>
-              <w:t xml:space="preserve"/>
+              <w:t xml:space="preserve">小野 健汰（おの けんた）</w:t>
             </w:r>
           </w:p>
         </w:tc>

</xml_diff>